<commit_message>
feat: add uml diagram and starting to documentation
</commit_message>
<xml_diff>
--- a/docs/documentation.docx
+++ b/docs/documentation.docx
@@ -3,306 +3,331 @@
 <w:document xmlns:wpc="http://schemas.microsoft.com/office/word/2010/wordprocessingCanvas" xmlns:cx="http://schemas.microsoft.com/office/drawing/2014/chartex" xmlns:cx1="http://schemas.microsoft.com/office/drawing/2015/9/8/chartex" xmlns:cx2="http://schemas.microsoft.com/office/drawing/2015/10/21/chartex" xmlns:cx3="http://schemas.microsoft.com/office/drawing/2016/5/9/chartex" xmlns:cx4="http://schemas.microsoft.com/office/drawing/2016/5/10/chartex" xmlns:cx5="http://schemas.microsoft.com/office/drawing/2016/5/11/chartex" xmlns:cx6="http://schemas.microsoft.com/office/drawing/2016/5/12/chartex" xmlns:cx7="http://schemas.microsoft.com/office/drawing/2016/5/13/chartex" xmlns:cx8="http://schemas.microsoft.com/office/drawing/2016/5/14/chartex" xmlns:mc="http://schemas.openxmlformats.org/markup-compatibility/2006" xmlns:aink="http://schemas.microsoft.com/office/drawing/2016/ink" xmlns:am3d="http://schemas.microsoft.com/office/drawing/2017/model3d" xmlns:o="urn:schemas-microsoft-com:office:office" xmlns:oel="http://schemas.microsoft.com/office/2019/extlst" xmlns:r="http://schemas.openxmlformats.org/officeDocument/2006/relationships" xmlns:m="http://schemas.openxmlformats.org/officeDocument/2006/math" xmlns:v="urn:schemas-microsoft-com:vml" xmlns:wp14="http://schemas.microsoft.com/office/word/2010/wordprocessingDrawing" xmlns:wp="http://schemas.openxmlformats.org/drawingml/2006/wordprocessingDrawing" xmlns:w10="urn:schemas-microsoft-com:office:word" xmlns:w="http://schemas.openxmlformats.org/wordprocessingml/2006/main" xmlns:w14="http://schemas.microsoft.com/office/word/2010/wordml" xmlns:w15="http://schemas.microsoft.com/office/word/2012/wordml" xmlns:w16cex="http://schemas.microsoft.com/office/word/2018/wordml/cex" xmlns:w16cid="http://schemas.microsoft.com/office/word/2016/wordml/cid" xmlns:w16="http://schemas.microsoft.com/office/word/2018/wordml" xmlns:w16du="http://schemas.microsoft.com/office/word/2023/wordml/word16du" xmlns:w16sdtdh="http://schemas.microsoft.com/office/word/2020/wordml/sdtdatahash" xmlns:w16sdtfl="http://schemas.microsoft.com/office/word/2024/wordml/sdtformatlock" xmlns:w16se="http://schemas.microsoft.com/office/word/2015/wordml/symex" xmlns:wpg="http://schemas.microsoft.com/office/word/2010/wordprocessingGroup" xmlns:wpi="http://schemas.microsoft.com/office/word/2010/wordprocessingInk" xmlns:wne="http://schemas.microsoft.com/office/word/2006/wordml" xmlns:wps="http://schemas.microsoft.com/office/word/2010/wordprocessingShape" mc:Ignorable="w14 w15 w16se w16cid w16 w16cex w16sdtdh w16sdtfl w16du wp14">
   <w:body>
     <w:p>
-      <w:r>
-        <w:t>Clases</w:t>
-      </w:r>
-      <w:r>
-        <w:t>:</w:t>
-      </w:r>
-    </w:p>
-    <w:p>
+      <w:pPr>
+        <w:rPr>
+          <w:rFonts w:ascii="Times New Roman" w:hAnsi="Times New Roman" w:cs="Times New Roman"/>
+          <w:b/>
+          <w:bCs/>
+          <w:i/>
+          <w:iCs/>
+        </w:rPr>
+      </w:pPr>
       <w:proofErr w:type="spellStart"/>
       <w:r>
-        <w:t>Exercise</w:t>
+        <w:rPr>
+          <w:rFonts w:ascii="Times New Roman" w:hAnsi="Times New Roman" w:cs="Times New Roman"/>
+          <w:b/>
+          <w:bCs/>
+          <w:i/>
+          <w:iCs/>
+        </w:rPr>
+        <w:t>Abstract</w:t>
       </w:r>
       <w:proofErr w:type="spellEnd"/>
-      <w:r>
-        <w:t xml:space="preserve"> (clase abstracta): </w:t>
-      </w:r>
-      <w:r>
-        <w:t>Define la plantilla (</w:t>
-      </w:r>
-      <w:proofErr w:type="spellStart"/>
-      <w:r>
-        <w:t>Template</w:t>
-      </w:r>
-      <w:proofErr w:type="spellEnd"/>
-      <w:r>
-        <w:t xml:space="preserve"> </w:t>
-      </w:r>
-      <w:proofErr w:type="spellStart"/>
-      <w:r>
-        <w:t>Method</w:t>
-      </w:r>
-      <w:proofErr w:type="spellEnd"/>
-      <w:r>
-        <w:t xml:space="preserve">) para procesar un ejercicio: </w:t>
-      </w:r>
-      <w:proofErr w:type="spellStart"/>
-      <w:proofErr w:type="gramStart"/>
-      <w:r>
-        <w:t>process</w:t>
-      </w:r>
-      <w:proofErr w:type="spellEnd"/>
-      <w:r>
-        <w:t>(</w:t>
-      </w:r>
-      <w:proofErr w:type="gramEnd"/>
-      <w:r>
-        <w:t xml:space="preserve">), </w:t>
-      </w:r>
-      <w:proofErr w:type="spellStart"/>
-      <w:r>
-        <w:t>update</w:t>
-      </w:r>
-      <w:proofErr w:type="spellEnd"/>
-      <w:r>
-        <w:t xml:space="preserve">(), </w:t>
-      </w:r>
-      <w:proofErr w:type="spellStart"/>
-      <w:r>
-        <w:t>draw</w:t>
-      </w:r>
-      <w:proofErr w:type="spellEnd"/>
-      <w:r>
-        <w:t>().</w:t>
-      </w:r>
-    </w:p>
-    <w:p>
-      <w:r>
-        <w:t xml:space="preserve">Subclases de </w:t>
-      </w:r>
-      <w:proofErr w:type="spellStart"/>
-      <w:r>
-        <w:t>exercise</w:t>
-      </w:r>
-      <w:proofErr w:type="spellEnd"/>
-      <w:r>
-        <w:t>: Cada u</w:t>
-      </w:r>
-      <w:r>
-        <w:t xml:space="preserve">na con su lógica específica de </w:t>
-      </w:r>
-      <w:proofErr w:type="spellStart"/>
-      <w:r>
-        <w:t>update</w:t>
-      </w:r>
-      <w:proofErr w:type="spellEnd"/>
-      <w:r>
-        <w:t xml:space="preserve"> y </w:t>
-      </w:r>
-      <w:proofErr w:type="spellStart"/>
-      <w:proofErr w:type="gramStart"/>
-      <w:r>
-        <w:t>draw</w:t>
-      </w:r>
-      <w:proofErr w:type="spellEnd"/>
-      <w:r>
-        <w:t>(</w:t>
-      </w:r>
-      <w:proofErr w:type="gramEnd"/>
-      <w:r>
-        <w:t>)</w:t>
-      </w:r>
     </w:p>
     <w:p>
       <w:pPr>
         <w:rPr>
-          <w:lang w:val="en-US"/>
+          <w:rFonts w:ascii="Times New Roman" w:hAnsi="Times New Roman" w:cs="Times New Roman"/>
         </w:rPr>
       </w:pPr>
+      <w:r>
+        <w:rPr>
+          <w:rFonts w:ascii="Times New Roman" w:hAnsi="Times New Roman" w:cs="Times New Roman"/>
+        </w:rPr>
+        <w:t xml:space="preserve">AI </w:t>
+      </w:r>
       <w:proofErr w:type="spellStart"/>
       <w:r>
         <w:rPr>
-          <w:lang w:val="en-US"/>
-        </w:rPr>
-        <w:t>CurlExercise</w:t>
+          <w:rFonts w:ascii="Times New Roman" w:hAnsi="Times New Roman" w:cs="Times New Roman"/>
+        </w:rPr>
+        <w:t>Trainer</w:t>
       </w:r>
       <w:proofErr w:type="spellEnd"/>
       <w:r>
         <w:rPr>
-          <w:lang w:val="en-US"/>
-        </w:rPr>
-        <w:t xml:space="preserve">, </w:t>
+          <w:rFonts w:ascii="Times New Roman" w:hAnsi="Times New Roman" w:cs="Times New Roman"/>
+        </w:rPr>
+        <w:t xml:space="preserve"> – Virtual </w:t>
       </w:r>
       <w:proofErr w:type="spellStart"/>
       <w:r>
         <w:rPr>
-          <w:lang w:val="en-US"/>
-        </w:rPr>
-        <w:t>SquatExercise</w:t>
+          <w:rFonts w:ascii="Times New Roman" w:hAnsi="Times New Roman" w:cs="Times New Roman"/>
+        </w:rPr>
+        <w:t>Gym</w:t>
       </w:r>
       <w:proofErr w:type="spellEnd"/>
       <w:r>
         <w:rPr>
-          <w:lang w:val="en-US"/>
-        </w:rPr>
-        <w:t xml:space="preserve">, </w:t>
-      </w:r>
-      <w:proofErr w:type="spellStart"/>
-      <w:r>
-        <w:rPr>
-          <w:lang w:val="en-US"/>
-        </w:rPr>
-        <w:t>PushupExercise</w:t>
-      </w:r>
-      <w:proofErr w:type="spellEnd"/>
-      <w:r>
-        <w:rPr>
-          <w:lang w:val="en-US"/>
-        </w:rPr>
-        <w:t xml:space="preserve">, </w:t>
-      </w:r>
-      <w:proofErr w:type="spellStart"/>
-      <w:r>
-        <w:rPr>
-          <w:lang w:val="en-US"/>
-        </w:rPr>
-        <w:t>PlankExercise</w:t>
-      </w:r>
-      <w:proofErr w:type="spellEnd"/>
-      <w:r>
-        <w:rPr>
-          <w:lang w:val="en-US"/>
-        </w:rPr>
-        <w:t xml:space="preserve"> </w:t>
+          <w:rFonts w:ascii="Times New Roman" w:hAnsi="Times New Roman" w:cs="Times New Roman"/>
+        </w:rPr>
+        <w:t xml:space="preserve"> es una aplicación basada en inteligencia artificial diseñada para detectar y analizar en tiempo real la ejecución de ejercicios físicos. Utilizando un modelo YOLO para la estimación de poses y un conjunto de módulos especializados para el procesamiento de datos, el sistema calcula métricas biomecánicas (como el rango de movimiento, velocidad media y máxima) y exporta los resultados para su análisis posterior. Est</w:t>
+      </w:r>
+      <w:r>
+        <w:rPr>
+          <w:rFonts w:ascii="Times New Roman" w:hAnsi="Times New Roman" w:cs="Times New Roman"/>
+        </w:rPr>
+        <w:t xml:space="preserve">a documentación </w:t>
+      </w:r>
+      <w:r>
+        <w:rPr>
+          <w:rFonts w:ascii="Times New Roman" w:hAnsi="Times New Roman" w:cs="Times New Roman"/>
+        </w:rPr>
+        <w:t>describe la arquitectura del sistema, el diseño orientado a objetos implementado mediante UML, el flujo de datos y la base teórica que respalda las metodologías empleadas.</w:t>
       </w:r>
     </w:p>
     <w:p>
-      <w:proofErr w:type="spellStart"/>
-      <w:r>
-        <w:t>PoseEstimator</w:t>
-      </w:r>
-      <w:proofErr w:type="spellEnd"/>
-      <w:r>
-        <w:t>:  Se encarga de la d</w:t>
-      </w:r>
-      <w:r>
-        <w:t>etección de puntos clave usando YOLO</w:t>
+      <w:pPr>
+        <w:rPr>
+          <w:rFonts w:ascii="Times New Roman" w:hAnsi="Times New Roman" w:cs="Times New Roman"/>
+        </w:rPr>
+      </w:pPr>
+      <w:r>
+        <w:rPr>
+          <w:rFonts w:ascii="Times New Roman" w:hAnsi="Times New Roman" w:cs="Times New Roman"/>
+          <w:b/>
+          <w:bCs/>
+        </w:rPr>
+        <w:t>Introducción</w:t>
       </w:r>
     </w:p>
     <w:p>
+      <w:pPr>
+        <w:rPr>
+          <w:rFonts w:ascii="Times New Roman" w:hAnsi="Times New Roman" w:cs="Times New Roman"/>
+        </w:rPr>
+      </w:pPr>
+      <w:r>
+        <w:rPr>
+          <w:rFonts w:ascii="Times New Roman" w:hAnsi="Times New Roman" w:cs="Times New Roman"/>
+        </w:rPr>
+        <w:t xml:space="preserve">El entrenamiento físico y la corrección de la técnica son fundamentales para optimizar el rendimiento y prevenir lesiones. Aunque la supervisión de un entrenador es invaluable, contar con herramientas que complementen su labor puede potenciar la retroalimentación técnica y brindar datos objetivos en tiempo real. AI </w:t>
+      </w:r>
       <w:proofErr w:type="spellStart"/>
       <w:r>
-        <w:t>Metrics</w:t>
+        <w:rPr>
+          <w:rFonts w:ascii="Times New Roman" w:hAnsi="Times New Roman" w:cs="Times New Roman"/>
+        </w:rPr>
+        <w:t>Trainer</w:t>
       </w:r>
       <w:proofErr w:type="spellEnd"/>
       <w:r>
-        <w:t xml:space="preserve">: Realiza el cálculo de métricas clave (ROM, </w:t>
+        <w:rPr>
+          <w:rFonts w:ascii="Times New Roman" w:hAnsi="Times New Roman" w:cs="Times New Roman"/>
+        </w:rPr>
+        <w:t xml:space="preserve"> – Virtual </w:t>
       </w:r>
       <w:proofErr w:type="spellStart"/>
       <w:r>
-        <w:t>Vmax</w:t>
+        <w:rPr>
+          <w:rFonts w:ascii="Times New Roman" w:hAnsi="Times New Roman" w:cs="Times New Roman"/>
+        </w:rPr>
+        <w:t>Gym</w:t>
       </w:r>
       <w:proofErr w:type="spellEnd"/>
       <w:r>
-        <w:t xml:space="preserve">, </w:t>
-      </w:r>
-      <w:proofErr w:type="spellStart"/>
-      <w:r>
-        <w:t>Vmed</w:t>
-      </w:r>
-      <w:proofErr w:type="spellEnd"/>
-      <w:r>
-        <w:t xml:space="preserve">) y usa </w:t>
-      </w:r>
-      <w:proofErr w:type="spellStart"/>
-      <w:r>
-        <w:t>Anthropometry</w:t>
-      </w:r>
-      <w:proofErr w:type="spellEnd"/>
-      <w:r>
-        <w:t xml:space="preserve"> para cálculo de longitudes efectivas.</w:t>
+        <w:rPr>
+          <w:rFonts w:ascii="Times New Roman" w:hAnsi="Times New Roman" w:cs="Times New Roman"/>
+        </w:rPr>
+        <w:t xml:space="preserve"> se concibe como un sistema de apoyo que detecta poses y analiza ejercicios en tiempo real, proporcionando métricas y visualizaciones detalladas que facilitan la corrección y mejora de la técnica, sin reemplazar la supervisión humana.</w:t>
       </w:r>
     </w:p>
     <w:p>
-      <w:proofErr w:type="spellStart"/>
-      <w:r>
-        <w:t>Anthropometry</w:t>
-      </w:r>
-      <w:proofErr w:type="spellEnd"/>
-      <w:r>
-        <w:t>: Métodos estáticos para calcular longitudes efectivas de antebrazo y tibia</w:t>
+      <w:pPr>
+        <w:rPr>
+          <w:rFonts w:ascii="Times New Roman" w:hAnsi="Times New Roman" w:cs="Times New Roman"/>
+          <w:b/>
+          <w:bCs/>
+        </w:rPr>
+      </w:pPr>
+      <w:r>
+        <w:rPr>
+          <w:rFonts w:ascii="Times New Roman" w:hAnsi="Times New Roman" w:cs="Times New Roman"/>
+          <w:b/>
+          <w:bCs/>
+        </w:rPr>
+        <w:t>Objetivos</w:t>
       </w:r>
     </w:p>
     <w:p>
-      <w:proofErr w:type="spellStart"/>
-      <w:r>
-        <w:t>MotionAnalyzer</w:t>
-      </w:r>
-      <w:proofErr w:type="spellEnd"/>
-      <w:r>
-        <w:t>: Dibuja elementos gráficos como barra de progreso, ruedas y recuadros.</w:t>
-      </w:r>
-    </w:p>
-    <w:p/>
-    <w:p>
-      <w:r>
-        <w:br/>
-        <w:t xml:space="preserve">Funciones en módulos </w:t>
-      </w:r>
-      <w:proofErr w:type="spellStart"/>
-      <w:r>
-        <w:t>utils</w:t>
-      </w:r>
-      <w:proofErr w:type="spellEnd"/>
-      <w:r>
-        <w:t>:</w:t>
-      </w:r>
+      <w:pPr>
+        <w:rPr>
+          <w:rFonts w:ascii="Times New Roman" w:hAnsi="Times New Roman" w:cs="Times New Roman"/>
+        </w:rPr>
+      </w:pPr>
     </w:p>
     <w:p>
-      <w:proofErr w:type="spellStart"/>
-      <w:r>
-        <w:t>Csv_exporter</w:t>
-      </w:r>
-      <w:proofErr w:type="spellEnd"/>
-      <w:r>
-        <w:t xml:space="preserve">: exporta las diferentes métricas junto a información adicional en un archivo </w:t>
-      </w:r>
-      <w:proofErr w:type="spellStart"/>
-      <w:r>
-        <w:t>csv</w:t>
-      </w:r>
-      <w:proofErr w:type="spellEnd"/>
-      <w:r>
-        <w:t xml:space="preserve"> llamado {NombreEjercicio}_metrics.csv</w:t>
+      <w:pPr>
+        <w:rPr>
+          <w:rFonts w:ascii="Times New Roman" w:hAnsi="Times New Roman" w:cs="Times New Roman"/>
+        </w:rPr>
+      </w:pPr>
+      <w:r>
+        <w:rPr>
+          <w:rFonts w:ascii="Times New Roman" w:hAnsi="Times New Roman" w:cs="Times New Roman"/>
+        </w:rPr>
+        <w:t>Visión general de la arquitectura</w:t>
       </w:r>
     </w:p>
     <w:p>
-      <w:r>
-        <w:t>_</w:t>
-      </w:r>
-      <w:proofErr w:type="spellStart"/>
-      <w:r>
-        <w:t>utils</w:t>
-      </w:r>
-      <w:proofErr w:type="spellEnd"/>
-      <w:r>
-        <w:t>:</w:t>
+      <w:pPr>
+        <w:rPr>
+          <w:rFonts w:ascii="Times New Roman" w:hAnsi="Times New Roman" w:cs="Times New Roman"/>
+        </w:rPr>
+      </w:pPr>
+      <w:r>
+        <w:rPr>
+          <w:rFonts w:ascii="Times New Roman" w:hAnsi="Times New Roman" w:cs="Times New Roman"/>
+        </w:rPr>
+        <w:t>Diagrama de alto nivel</w:t>
       </w:r>
     </w:p>
     <w:p>
-      <w:proofErr w:type="spellStart"/>
-      <w:r>
-        <w:t>Drawing</w:t>
-      </w:r>
-      <w:proofErr w:type="spellEnd"/>
-      <w:r>
-        <w:t>:</w:t>
+      <w:pPr>
+        <w:rPr>
+          <w:rFonts w:ascii="Times New Roman" w:hAnsi="Times New Roman" w:cs="Times New Roman"/>
+        </w:rPr>
+      </w:pPr>
+      <w:r>
+        <w:rPr>
+          <w:rFonts w:ascii="Times New Roman" w:hAnsi="Times New Roman" w:cs="Times New Roman"/>
+          <w:noProof/>
+        </w:rPr>
+        <w:lastRenderedPageBreak/>
+        <w:drawing>
+          <wp:inline distT="0" distB="0" distL="0" distR="0" wp14:anchorId="59F83665" wp14:editId="72C2B208">
+            <wp:extent cx="5612130" cy="4991100"/>
+            <wp:effectExtent l="0" t="0" r="7620" b="0"/>
+            <wp:docPr id="159695397" name="Imagen 1" descr="Tabla&#10;&#10;El contenido generado por IA puede ser incorrecto."/>
+            <wp:cNvGraphicFramePr>
+              <a:graphicFrameLocks xmlns:a="http://schemas.openxmlformats.org/drawingml/2006/main" noChangeAspect="1"/>
+            </wp:cNvGraphicFramePr>
+            <a:graphic xmlns:a="http://schemas.openxmlformats.org/drawingml/2006/main">
+              <a:graphicData uri="http://schemas.openxmlformats.org/drawingml/2006/picture">
+                <pic:pic xmlns:pic="http://schemas.openxmlformats.org/drawingml/2006/picture">
+                  <pic:nvPicPr>
+                    <pic:cNvPr id="159695397" name="Imagen 1" descr="Tabla&#10;&#10;El contenido generado por IA puede ser incorrecto."/>
+                    <pic:cNvPicPr>
+                      <a:picLocks noChangeAspect="1" noChangeArrowheads="1"/>
+                    </pic:cNvPicPr>
+                  </pic:nvPicPr>
+                  <pic:blipFill>
+                    <a:blip r:embed="rId4" cstate="print">
+                      <a:extLst>
+                        <a:ext uri="{28A0092B-C50C-407E-A947-70E740481C1C}">
+                          <a14:useLocalDpi xmlns:a14="http://schemas.microsoft.com/office/drawing/2010/main" val="0"/>
+                        </a:ext>
+                      </a:extLst>
+                    </a:blip>
+                    <a:srcRect/>
+                    <a:stretch>
+                      <a:fillRect/>
+                    </a:stretch>
+                  </pic:blipFill>
+                  <pic:spPr bwMode="auto">
+                    <a:xfrm>
+                      <a:off x="0" y="0"/>
+                      <a:ext cx="5612130" cy="4991100"/>
+                    </a:xfrm>
+                    <a:prstGeom prst="rect">
+                      <a:avLst/>
+                    </a:prstGeom>
+                    <a:noFill/>
+                    <a:ln>
+                      <a:noFill/>
+                    </a:ln>
+                  </pic:spPr>
+                </pic:pic>
+              </a:graphicData>
+            </a:graphic>
+          </wp:inline>
+        </w:drawing>
       </w:r>
     </w:p>
     <w:p>
-      <w:proofErr w:type="spellStart"/>
-      <w:r>
-        <w:t>Visors</w:t>
-      </w:r>
-      <w:proofErr w:type="spellEnd"/>
-      <w:r>
-        <w:t xml:space="preserve">: </w:t>
+      <w:pPr>
+        <w:rPr>
+          <w:rFonts w:ascii="Times New Roman" w:hAnsi="Times New Roman" w:cs="Times New Roman"/>
+        </w:rPr>
+      </w:pPr>
+      <w:r>
+        <w:rPr>
+          <w:rFonts w:ascii="Times New Roman" w:hAnsi="Times New Roman" w:cs="Times New Roman"/>
+        </w:rPr>
+        <w:t>Diagrama UML clases</w:t>
       </w:r>
     </w:p>
-    <w:p/>
-    <w:p/>
+    <w:p>
+      <w:pPr>
+        <w:rPr>
+          <w:rFonts w:ascii="Times New Roman" w:hAnsi="Times New Roman" w:cs="Times New Roman"/>
+        </w:rPr>
+      </w:pPr>
+      <w:r>
+        <w:rPr>
+          <w:rFonts w:ascii="Times New Roman" w:hAnsi="Times New Roman" w:cs="Times New Roman"/>
+          <w:noProof/>
+        </w:rPr>
+        <w:lastRenderedPageBreak/>
+        <w:drawing>
+          <wp:inline distT="0" distB="0" distL="0" distR="0" wp14:anchorId="5551CB97" wp14:editId="6E4BF353">
+            <wp:extent cx="5598795" cy="5132705"/>
+            <wp:effectExtent l="0" t="0" r="1905" b="0"/>
+            <wp:docPr id="1283978894" name="Imagen 2"/>
+            <wp:cNvGraphicFramePr>
+              <a:graphicFrameLocks xmlns:a="http://schemas.openxmlformats.org/drawingml/2006/main" noChangeAspect="1"/>
+            </wp:cNvGraphicFramePr>
+            <a:graphic xmlns:a="http://schemas.openxmlformats.org/drawingml/2006/main">
+              <a:graphicData uri="http://schemas.openxmlformats.org/drawingml/2006/picture">
+                <pic:pic xmlns:pic="http://schemas.openxmlformats.org/drawingml/2006/picture">
+                  <pic:nvPicPr>
+                    <pic:cNvPr id="0" name="Picture 3"/>
+                    <pic:cNvPicPr>
+                      <a:picLocks noChangeAspect="1" noChangeArrowheads="1"/>
+                    </pic:cNvPicPr>
+                  </pic:nvPicPr>
+                  <pic:blipFill>
+                    <a:blip r:embed="rId5" cstate="print">
+                      <a:extLst>
+                        <a:ext uri="{28A0092B-C50C-407E-A947-70E740481C1C}">
+                          <a14:useLocalDpi xmlns:a14="http://schemas.microsoft.com/office/drawing/2010/main" val="0"/>
+                        </a:ext>
+                      </a:extLst>
+                    </a:blip>
+                    <a:srcRect/>
+                    <a:stretch>
+                      <a:fillRect/>
+                    </a:stretch>
+                  </pic:blipFill>
+                  <pic:spPr bwMode="auto">
+                    <a:xfrm>
+                      <a:off x="0" y="0"/>
+                      <a:ext cx="5598795" cy="5132705"/>
+                    </a:xfrm>
+                    <a:prstGeom prst="rect">
+                      <a:avLst/>
+                    </a:prstGeom>
+                    <a:noFill/>
+                    <a:ln>
+                      <a:noFill/>
+                    </a:ln>
+                  </pic:spPr>
+                </pic:pic>
+              </a:graphicData>
+            </a:graphic>
+          </wp:inline>
+        </w:drawing>
+      </w:r>
+    </w:p>
+    <w:p>
+      <w:pPr>
+        <w:rPr>
+          <w:rFonts w:ascii="Times New Roman" w:hAnsi="Times New Roman" w:cs="Times New Roman"/>
+        </w:rPr>
+      </w:pPr>
+    </w:p>
     <w:sectPr>
       <w:pgSz w:w="12240" w:h="15840"/>
       <w:pgMar w:top="1417" w:right="1701" w:bottom="1417" w:left="1701" w:header="720" w:footer="720" w:gutter="0"/>

</xml_diff>